<commit_message>
Bring the docs in line with what has actually run
Most status notes predated the Snowflake run: the README still marked the
transformation layer as stubbed after it had passed 19/19 on Snowflake.
The README, workflow PDF/Word, production-readiness and agent docs now
report verified results with their evidence, and list separately the code
that is not part of the results.

The agents run on a local model so no data goes to a model vendor, so the
unused hosted-model client is no longer referenced from code, CI or
requirements.
</commit_message>
<xml_diff>
--- a/docs/workflow-and-tech-stack.docx
+++ b/docs/workflow-and-tech-stack.docx
@@ -118,7 +118,7 @@
                 <w:i w:val="0"/>
                 <w:sz w:val="19"/>
               </w:rPr>
-              <w:t>Status (14 Oct 2026):</w:t>
+              <w:t>What has run:</w:t>
             </w:r>
             <w:r>
               <w:rPr>
@@ -126,55 +126,7 @@
                 <w:i w:val="0"/>
                 <w:sz w:val="19"/>
               </w:rPr>
-              <w:t xml:space="preserve"> verified locally — sample-data generators, DLQ routing, ONNX anomaly model, </w:t>
-            </w:r>
-            <w:r>
-              <w:rPr>
-                <w:b w:val="0"/>
-                <w:i/>
-                <w:sz w:val="19"/>
-              </w:rPr>
-              <w:t>dbt parse</w:t>
-            </w:r>
-            <w:r>
-              <w:rPr>
-                <w:b w:val="0"/>
-                <w:i w:val="0"/>
-                <w:sz w:val="19"/>
-              </w:rPr>
-              <w:t xml:space="preserve">, Dagster graph validation, </w:t>
-            </w:r>
-            <w:r>
-              <w:rPr>
-                <w:b w:val="0"/>
-                <w:i/>
-                <w:sz w:val="19"/>
-              </w:rPr>
-              <w:t>terraform validate</w:t>
-            </w:r>
-            <w:r>
-              <w:rPr>
-                <w:b w:val="0"/>
-                <w:i w:val="0"/>
-                <w:sz w:val="19"/>
-              </w:rPr>
-              <w:t xml:space="preserve">, and the local Kafka + observability stack (metrics, alerts and dashboard checked with replayed data); CI passes on GitHub. A Snowflake trial account exists and is being connected (key-pair auth set up). </w:t>
-            </w:r>
-            <w:r>
-              <w:rPr>
-                <w:b/>
-                <w:i w:val="0"/>
-                <w:sz w:val="19"/>
-              </w:rPr>
-              <w:t>No SQL has run against live Snowflake yet</w:t>
-            </w:r>
-            <w:r>
-              <w:rPr>
-                <w:b w:val="0"/>
-                <w:i w:val="0"/>
-                <w:sz w:val="19"/>
-              </w:rPr>
-              <w:t>; the glue agents and guardrail gateway are planned, not built.</w:t>
+              <w:t xml:space="preserve"> Bronze → Silver → Gold on a Snowflake trial account (dbt 19/19, 9,795 rows reconciled), the 15-minute delay policy tested across 12 role and timezone combinations, the local Kafka + observability stack, the analyst agent (13/15 on its eval, 8/8 attacks blocked) and the pipeline doctor, both on a local model. Results and screenshots: docs/snowflake-results.md, docs/stack-results.md, docs/project-summary.md.</w:t>
             </w:r>
           </w:p>
         </w:tc>
@@ -3485,7 +3437,7 @@
           <w:b w:val="0"/>
           <w:i w:val="0"/>
         </w:rPr>
-        <w:t>K. Planned: glue agents behind a guardrail gateway</w:t>
+        <w:t>K. Glue agents and guardrails (local model)</w:t>
       </w:r>
     </w:p>
     <w:tbl>
@@ -3599,7 +3551,7 @@
                 <w:i w:val="0"/>
                 <w:sz w:val="17"/>
               </w:rPr>
-              <w:t>Analyst glue: asks the Cortex Agent, checks the answer came from executed SQL, returns it with as-of time and citations, or escalates.</w:t>
+              <w:t>Analyst agent: plain-English question → one SQL query from the local model → AST guardrail (read-only, Gold tables only, row cap) → runs as ANALYST_AGENT under the delay policy → audit row.</w:t>
             </w:r>
           </w:p>
         </w:tc>
@@ -3614,7 +3566,7 @@
                 <w:i w:val="0"/>
                 <w:sz w:val="17"/>
               </w:rPr>
-              <w:t>Claude on Vertex AI</w:t>
+              <w:t>Ollama qwen3:14b · sqlglot</w:t>
             </w:r>
           </w:p>
         </w:tc>
@@ -3629,7 +3581,7 @@
                 <w:i w:val="0"/>
                 <w:sz w:val="17"/>
               </w:rPr>
-              <w:t>docs/glue-and-guardrails.md</w:t>
+              <w:t>glue/analyst.py, glue/guardrails.py</w:t>
             </w:r>
           </w:p>
         </w:tc>
@@ -3663,7 +3615,7 @@
                 <w:i w:val="0"/>
                 <w:sz w:val="17"/>
               </w:rPr>
-              <w:t>Incident glue: on an alert, checks systems in order, names the first broken link with evidence, proposes the runbook step.</w:t>
+              <w:t>Pipeline doctor: on a failed check, investigates with read-only SQL, finds the matching catalog problem (hybrid search), picks one human-written runbook action, applies it in a throwaway clone, re-runs dbt and the checks, and proposes the production fix for approval, or escalates.</w:t>
             </w:r>
           </w:p>
         </w:tc>
@@ -3679,7 +3631,7 @@
                 <w:i w:val="0"/>
                 <w:sz w:val="17"/>
               </w:rPr>
-              <w:t>Claude on Vertex AI + MCP</w:t>
+              <w:t>Ollama qwen3:14b + nomic-embed-text</w:t>
             </w:r>
           </w:p>
         </w:tc>
@@ -3695,7 +3647,7 @@
                 <w:i w:val="0"/>
                 <w:sz w:val="17"/>
               </w:rPr>
-              <w:t>docs/glue-and-guardrails.md</w:t>
+              <w:t>glue/doctor.py</w:t>
             </w:r>
           </w:p>
         </w:tc>
@@ -3727,7 +3679,7 @@
                 <w:i w:val="0"/>
                 <w:sz w:val="17"/>
               </w:rPr>
-              <w:t>Change glue: drafts the dbt model and tests, opens a PR with a stage report, deploys after approval.</w:t>
+              <w:t>Snowflake CI: each pull request is built and tested in a zero-copy clone of Silver, then the clone is dropped. CD: merges deploy to MARKET_AGENT only after a human approves, then re-run the checks.</w:t>
             </w:r>
           </w:p>
         </w:tc>
@@ -3742,7 +3694,7 @@
                 <w:i w:val="0"/>
                 <w:sz w:val="17"/>
               </w:rPr>
-              <w:t>Claude on Vertex AI + dbt/GitHub MCP</w:t>
+              <w:t>GitHub Actions · dbt</w:t>
             </w:r>
           </w:p>
         </w:tc>
@@ -3757,7 +3709,7 @@
                 <w:i w:val="0"/>
                 <w:sz w:val="17"/>
               </w:rPr>
-              <w:t>docs/modeling-agents-study.md</w:t>
+              <w:t>.github/workflows/snowflake-ci.yml, snowflake-cd.yml</w:t>
             </w:r>
           </w:p>
         </w:tc>
@@ -3791,7 +3743,7 @@
                 <w:i w:val="0"/>
                 <w:sz w:val="17"/>
               </w:rPr>
-              <w:t>Gateway on every tool call: read/draft automatic; reversible prod change = 1 approval; irreversible, access or money = approval + reviewed plan; secrets, weakening checks, widening access blocked; budgets; audit.</w:t>
+              <w:t>Why local: no data, schema or error text leaves for a model vendor; cost $0 per call.</w:t>
             </w:r>
           </w:p>
         </w:tc>
@@ -3807,7 +3759,7 @@
                 <w:i w:val="0"/>
                 <w:sz w:val="17"/>
               </w:rPr>
-              <w:t>Python (planned)</w:t>
+              <w:t>RTX 5070 Ti, 12 GB</w:t>
             </w:r>
           </w:p>
         </w:tc>
@@ -3823,69 +3775,7 @@
                 <w:i w:val="0"/>
                 <w:sz w:val="17"/>
               </w:rPr>
-              <w:t>docs/glue-and-guardrails.md §4</w:t>
-            </w:r>
-          </w:p>
-        </w:tc>
-      </w:tr>
-      <w:tr>
-        <w:tc>
-          <w:tcPr>
-            <w:tcW w:type="dxa" w:w="631"/>
-          </w:tcPr>
-          <w:p>
-            <w:r>
-              <w:rPr>
-                <w:b/>
-                <w:i w:val="0"/>
-                <w:sz w:val="17"/>
-              </w:rPr>
-              <w:t>K5</w:t>
-            </w:r>
-          </w:p>
-        </w:tc>
-        <w:tc>
-          <w:tcPr>
-            <w:tcW w:type="dxa" w:w="4836"/>
-          </w:tcPr>
-          <w:p>
-            <w:r>
-              <w:rPr>
-                <w:b w:val="0"/>
-                <w:i w:val="0"/>
-                <w:sz w:val="17"/>
-              </w:rPr>
-              <w:t>Model access: Claude through Vertex AI Model Garden in our GCP project (billing, IAM and audit in one cloud). Off by default; enabling the model in Model Garden is a human step. Analysts' questions stay on Snowflake Cortex so governed data never leaves Snowflake.</w:t>
-            </w:r>
-          </w:p>
-        </w:tc>
-        <w:tc>
-          <w:tcPr>
-            <w:tcW w:type="dxa" w:w="1892"/>
-          </w:tcPr>
-          <w:p>
-            <w:r>
-              <w:rPr>
-                <w:b w:val="0"/>
-                <w:i w:val="0"/>
-                <w:sz w:val="17"/>
-              </w:rPr>
-              <w:t>Vertex AI + Anthropic SDK</w:t>
-            </w:r>
-          </w:p>
-        </w:tc>
-        <w:tc>
-          <w:tcPr>
-            <w:tcW w:type="dxa" w:w="3154"/>
-          </w:tcPr>
-          <w:p>
-            <w:r>
-              <w:rPr>
-                <w:b w:val="0"/>
-                <w:i w:val="0"/>
-                <w:sz w:val="17"/>
-              </w:rPr>
-              <w:t>glue/llm.py, infra/terraform/vertex.tf</w:t>
+              <w:t>docs/glue-and-guardrails.md</w:t>
             </w:r>
           </w:p>
         </w:tc>
@@ -7064,7 +6954,7 @@
                 <w:i w:val="0"/>
                 <w:sz w:val="17"/>
               </w:rPr>
-              <w:t>Claude on Vertex AI Model Garden · Anthropic SDK [vertex]</w:t>
+              <w:t>Ollama · qwen3:14b · nomic-embed-text</w:t>
             </w:r>
           </w:p>
         </w:tc>
@@ -7080,7 +6970,7 @@
                 <w:i w:val="0"/>
                 <w:sz w:val="17"/>
               </w:rPr>
-              <w:t>service · 1.13.0</w:t>
+              <w:t>local</w:t>
             </w:r>
           </w:p>
         </w:tc>
@@ -7096,7 +6986,7 @@
                 <w:i w:val="0"/>
                 <w:sz w:val="17"/>
               </w:rPr>
-              <w:t>Glue agents behind the guardrail gateway (off by default)</w:t>
+              <w:t>Analyst agent and pipeline doctor; nothing sent to a model vendor</w:t>
             </w:r>
           </w:p>
         </w:tc>
@@ -7112,7 +7002,84 @@
                 <w:i w:val="0"/>
                 <w:sz w:val="17"/>
               </w:rPr>
-              <w:t>glue/llm.py, infra/terraform/vertex.tf</w:t>
+              <w:t>glue/</w:t>
+            </w:r>
+          </w:p>
+        </w:tc>
+      </w:tr>
+      <w:tr>
+        <w:tc>
+          <w:tcPr>
+            <w:tcW w:type="dxa" w:w="1332"/>
+          </w:tcPr>
+          <w:p>
+            <w:r>
+              <w:rPr>
+                <w:b/>
+                <w:i w:val="0"/>
+                <w:sz w:val="17"/>
+              </w:rPr>
+              <w:t>SQL guardrail</w:t>
+            </w:r>
+          </w:p>
+        </w:tc>
+        <w:tc>
+          <w:tcPr>
+            <w:tcW w:type="dxa" w:w="2593"/>
+          </w:tcPr>
+          <w:p>
+            <w:r>
+              <w:rPr>
+                <w:b w:val="0"/>
+                <w:i w:val="0"/>
+                <w:sz w:val="17"/>
+              </w:rPr>
+              <w:t>sqlglot</w:t>
+            </w:r>
+          </w:p>
+        </w:tc>
+        <w:tc>
+          <w:tcPr>
+            <w:tcW w:type="dxa" w:w="1892"/>
+          </w:tcPr>
+          <w:p>
+            <w:r>
+              <w:rPr>
+                <w:b w:val="0"/>
+                <w:i w:val="0"/>
+                <w:sz w:val="17"/>
+              </w:rPr>
+              <w:t>—</w:t>
+            </w:r>
+          </w:p>
+        </w:tc>
+        <w:tc>
+          <w:tcPr>
+            <w:tcW w:type="dxa" w:w="2453"/>
+          </w:tcPr>
+          <w:p>
+            <w:r>
+              <w:rPr>
+                <w:b w:val="0"/>
+                <w:i w:val="0"/>
+                <w:sz w:val="17"/>
+              </w:rPr>
+              <w:t>Parses model-written SQL; read-only, allow-listed tables, row cap</w:t>
+            </w:r>
+          </w:p>
+        </w:tc>
+        <w:tc>
+          <w:tcPr>
+            <w:tcW w:type="dxa" w:w="2243"/>
+          </w:tcPr>
+          <w:p>
+            <w:r>
+              <w:rPr>
+                <w:b w:val="0"/>
+                <w:i w:val="0"/>
+                <w:sz w:val="17"/>
+              </w:rPr>
+              <w:t>glue/guardrails.py</w:t>
             </w:r>
           </w:p>
         </w:tc>
@@ -7580,7 +7547,7 @@
           <w:b w:val="0"/>
           <w:i w:val="0"/>
         </w:rPr>
-        <w:t>Planned gateway: approve reversible production actions; approve + review irreversible ones.</w:t>
+        <w:t>Approve the pipeline doctor's proposed production fix; take over anything it escalates.</w:t>
       </w:r>
     </w:p>
     <w:p>
@@ -7597,7 +7564,7 @@
           <w:b w:val="0"/>
           <w:i w:val="0"/>
         </w:rPr>
-        <w:t>What's verified, written, and planned</w:t>
+        <w:t>What has been verified</w:t>
       </w:r>
     </w:p>
     <w:tbl>
@@ -7660,7 +7627,7 @@
                 <w:i w:val="0"/>
                 <w:sz w:val="17"/>
               </w:rPr>
-              <w:t>Sample data generators, DLQ routing, ONNX model training</w:t>
+              <w:t>Bronze → Silver → Gold on Snowflake</w:t>
             </w:r>
           </w:p>
         </w:tc>
@@ -7675,7 +7642,7 @@
                 <w:i w:val="0"/>
                 <w:sz w:val="17"/>
               </w:rPr>
-              <w:t>Verified locally (run against sample data)</w:t>
+              <w:t>dbt 19/19 pass; 9,795 rows reconciled across layers; 6 defects found and fixed</w:t>
             </w:r>
           </w:p>
         </w:tc>
@@ -7693,7 +7660,7 @@
                 <w:i w:val="0"/>
                 <w:sz w:val="17"/>
               </w:rPr>
-              <w:t>CI pipeline</w:t>
+              <w:t>15-minute delay policy</w:t>
             </w:r>
           </w:p>
         </w:tc>
@@ -7709,7 +7676,7 @@
                 <w:i w:val="0"/>
                 <w:sz w:val="17"/>
               </w:rPr>
-              <w:t>Passing on GitHub</w:t>
+              <w:t>Tested across 12 role × secondary-role × timezone combinations; a leak found and fixed</w:t>
             </w:r>
           </w:p>
         </w:tc>
@@ -7726,7 +7693,7 @@
                 <w:i w:val="0"/>
                 <w:sz w:val="17"/>
               </w:rPr>
-              <w:t>dbt project</w:t>
+              <w:t>Local Kafka + observability stack (OTel, Prometheus, Grafana, Jaeger)</w:t>
             </w:r>
           </w:p>
         </w:tc>
@@ -7741,7 +7708,7 @@
                 <w:i w:val="0"/>
                 <w:sz w:val="17"/>
               </w:rPr>
-              <w:t>dbt parse passes; not run against Snowflake</w:t>
+              <w:t>Replayed data reached Prometheus and matched Kafka offsets exactly; 4 alert rules load; dashboard renders</w:t>
             </w:r>
           </w:p>
         </w:tc>
@@ -7759,7 +7726,7 @@
                 <w:i w:val="0"/>
                 <w:sz w:val="17"/>
               </w:rPr>
-              <w:t>Dagster asset graph and schedules</w:t>
+              <w:t>Analyst agent (local model)</w:t>
             </w:r>
           </w:p>
         </w:tc>
@@ -7775,7 +7742,7 @@
                 <w:i w:val="0"/>
                 <w:sz w:val="17"/>
               </w:rPr>
-              <w:t>dagster definitions validate passes; not run against Snowflake</w:t>
+              <w:t>13/15 reference questions, 8/8 attacks blocked, 0 unsafe executions</w:t>
             </w:r>
           </w:p>
         </w:tc>
@@ -7792,7 +7759,7 @@
                 <w:i w:val="0"/>
                 <w:sz w:val="17"/>
               </w:rPr>
-              <w:t>Terraform</w:t>
+              <w:t>Pipeline doctor (local model)</w:t>
             </w:r>
           </w:p>
         </w:tc>
@@ -7807,7 +7774,7 @@
                 <w:i w:val="0"/>
                 <w:sz w:val="17"/>
               </w:rPr>
-              <w:t>terraform validate passes against real providers; not applied</w:t>
+              <w:t>5/5 injected faults diagnosed: 4 fixed and verified in a clone, 1 escalated; 0 production writes</w:t>
             </w:r>
           </w:p>
         </w:tc>
@@ -7825,7 +7792,7 @@
                 <w:i w:val="0"/>
                 <w:sz w:val="17"/>
               </w:rPr>
-              <w:t>All SQL (Bronze → Agent, governance, alerts, stop-spend)</w:t>
+              <w:t>Snowflake CI steps</w:t>
             </w:r>
           </w:p>
         </w:tc>
@@ -7841,7 +7808,7 @@
                 <w:i w:val="0"/>
                 <w:sz w:val="17"/>
               </w:rPr>
-              <w:t>Written; not yet run on the live trial</w:t>
+              <w:t>Clone 12 s, dbt 19/19 and 8/8 checks in the clone, clone dropped</w:t>
             </w:r>
           </w:p>
         </w:tc>
@@ -7858,7 +7825,7 @@
                 <w:i w:val="0"/>
                 <w:sz w:val="17"/>
               </w:rPr>
-              <w:t>Snowflake trial account + key-pair connection</w:t>
+              <w:t>pytest</w:t>
             </w:r>
           </w:p>
         </w:tc>
@@ -7873,7 +7840,7 @@
                 <w:i w:val="0"/>
                 <w:sz w:val="17"/>
               </w:rPr>
-              <w:t>Account active; key registration in progress</w:t>
+              <w:t>36 unit tests (SQL guardrail, doctor safety rules), run in CI</w:t>
             </w:r>
           </w:p>
         </w:tc>
@@ -7891,7 +7858,7 @@
                 <w:i w:val="0"/>
                 <w:sz w:val="17"/>
               </w:rPr>
-              <w:t>Local Kafka + observability stack (OTel, Prometheus, Grafana, Jaeger)</w:t>
+              <w:t>CI on GitHub</w:t>
             </w:r>
           </w:p>
         </w:tc>
@@ -7907,139 +7874,7 @@
                 <w:i w:val="0"/>
                 <w:sz w:val="17"/>
               </w:rPr>
-              <w:t>Verified locally: replayed data reached Prometheus and matched Kafka offsets; alerts and dashboard load</w:t>
-            </w:r>
-          </w:p>
-        </w:tc>
-      </w:tr>
-      <w:tr>
-        <w:tc>
-          <w:tcPr>
-            <w:tcW w:type="dxa" w:w="5326"/>
-          </w:tcPr>
-          <w:p>
-            <w:r>
-              <w:rPr>
-                <w:b/>
-                <w:i w:val="0"/>
-                <w:sz w:val="17"/>
-              </w:rPr>
-              <w:t>Vertex AI wiring</w:t>
-            </w:r>
-          </w:p>
-        </w:tc>
-        <w:tc>
-          <w:tcPr>
-            <w:tcW w:type="dxa" w:w="5186"/>
-          </w:tcPr>
-          <w:p>
-            <w:r>
-              <w:rPr>
-                <w:b w:val="0"/>
-                <w:i w:val="0"/>
-                <w:sz w:val="17"/>
-              </w:rPr>
-              <w:t>Client builds and terraform validates; no model call made (needs Model Garden enablement + budget)</w:t>
-            </w:r>
-          </w:p>
-        </w:tc>
-      </w:tr>
-      <w:tr>
-        <w:tc>
-          <w:tcPr>
-            <w:tcW w:type="dxa" w:w="5326"/>
-            <w:shd w:val="clear" w:color="auto" w:fill="F3F4F6"/>
-          </w:tcPr>
-          <w:p>
-            <w:r>
-              <w:rPr>
-                <w:b/>
-                <w:i w:val="0"/>
-                <w:sz w:val="17"/>
-              </w:rPr>
-              <w:t>Approval-gated deploy workflow</w:t>
-            </w:r>
-          </w:p>
-        </w:tc>
-        <w:tc>
-          <w:tcPr>
-            <w:tcW w:type="dxa" w:w="5186"/>
-            <w:shd w:val="clear" w:color="auto" w:fill="F3F4F6"/>
-          </w:tcPr>
-          <w:p>
-            <w:r>
-              <w:rPr>
-                <w:b w:val="0"/>
-                <w:i w:val="0"/>
-                <w:sz w:val="17"/>
-              </w:rPr>
-              <w:t>Written; not run</w:t>
-            </w:r>
-          </w:p>
-        </w:tc>
-      </w:tr>
-      <w:tr>
-        <w:tc>
-          <w:tcPr>
-            <w:tcW w:type="dxa" w:w="5326"/>
-          </w:tcPr>
-          <w:p>
-            <w:r>
-              <w:rPr>
-                <w:b/>
-                <w:i w:val="0"/>
-                <w:sz w:val="17"/>
-              </w:rPr>
-              <w:t>Glue agents + guardrail gateway</w:t>
-            </w:r>
-          </w:p>
-        </w:tc>
-        <w:tc>
-          <w:tcPr>
-            <w:tcW w:type="dxa" w:w="5186"/>
-          </w:tcPr>
-          <w:p>
-            <w:r>
-              <w:rPr>
-                <w:b w:val="0"/>
-                <w:i w:val="0"/>
-                <w:sz w:val="17"/>
-              </w:rPr>
-              <w:t>Planned (docs/glue-and-guardrails.md)</w:t>
-            </w:r>
-          </w:p>
-        </w:tc>
-      </w:tr>
-      <w:tr>
-        <w:tc>
-          <w:tcPr>
-            <w:tcW w:type="dxa" w:w="5326"/>
-            <w:shd w:val="clear" w:color="auto" w:fill="F3F4F6"/>
-          </w:tcPr>
-          <w:p>
-            <w:r>
-              <w:rPr>
-                <w:b/>
-                <w:i w:val="0"/>
-                <w:sz w:val="17"/>
-              </w:rPr>
-              <w:t>pytest suite</w:t>
-            </w:r>
-          </w:p>
-        </w:tc>
-        <w:tc>
-          <w:tcPr>
-            <w:tcW w:type="dxa" w:w="5186"/>
-            <w:shd w:val="clear" w:color="auto" w:fill="F3F4F6"/>
-          </w:tcPr>
-          <w:p>
-            <w:r>
-              <w:rPr>
-                <w:b w:val="0"/>
-                <w:i w:val="0"/>
-                <w:sz w:val="17"/>
-              </w:rPr>
-              <w:t>Not built yet</w:t>
+              <w:t>Passing: compile, generators, catalog + docs build, dbt parse, Dagster graph, Terraform, pytest</w:t>
             </w:r>
           </w:p>
         </w:tc>
@@ -8481,7 +8316,7 @@
                 <w:i w:val="0"/>
                 <w:sz w:val="17"/>
               </w:rPr>
-              <w:t>Check Vertex AI wiring (no cost)</w:t>
+              <w:t>Ask the analyst agent</w:t>
             </w:r>
           </w:p>
         </w:tc>
@@ -8497,7 +8332,7 @@
                 <w:i w:val="0"/>
                 <w:sz w:val="17"/>
               </w:rPr>
-              <w:t>python -m glue.llm --check</w:t>
+              <w:t>python -m glue.analyst "Which stock had the highest volume?"</w:t>
             </w:r>
           </w:p>
         </w:tc>
@@ -8514,7 +8349,7 @@
                 <w:i w:val="0"/>
                 <w:sz w:val="17"/>
               </w:rPr>
-              <w:t>Cap / pause spend</w:t>
+              <w:t>Run the pipeline doctor evaluation</w:t>
             </w:r>
           </w:p>
         </w:tc>
@@ -8529,7 +8364,7 @@
                 <w:i w:val="0"/>
                 <w:sz w:val="17"/>
               </w:rPr>
-              <w:t>Run sql/99_teardown/stop_spend.sql (levels 0–1) in Snowsight</w:t>
+              <w:t>python -m glue.eval_doctor</w:t>
             </w:r>
           </w:p>
         </w:tc>
@@ -8547,7 +8382,7 @@
                 <w:i w:val="0"/>
                 <w:sz w:val="17"/>
               </w:rPr>
-              <w:t>Rebuild these PDFs</w:t>
+              <w:t>Cap / pause spend</w:t>
             </w:r>
           </w:p>
         </w:tc>
@@ -8555,6 +8390,38 @@
           <w:tcPr>
             <w:tcW w:type="dxa" w:w="7709"/>
             <w:shd w:val="clear" w:color="auto" w:fill="F3F4F6"/>
+          </w:tcPr>
+          <w:p>
+            <w:r>
+              <w:rPr>
+                <w:b w:val="0"/>
+                <w:i w:val="0"/>
+                <w:sz w:val="17"/>
+              </w:rPr>
+              <w:t>Run sql/99_teardown/stop_spend.sql (levels 0–1) in Snowsight</w:t>
+            </w:r>
+          </w:p>
+        </w:tc>
+      </w:tr>
+      <w:tr>
+        <w:tc>
+          <w:tcPr>
+            <w:tcW w:type="dxa" w:w="2803"/>
+          </w:tcPr>
+          <w:p>
+            <w:r>
+              <w:rPr>
+                <w:b/>
+                <w:i w:val="0"/>
+                <w:sz w:val="17"/>
+              </w:rPr>
+              <w:t>Rebuild these PDFs</w:t>
+            </w:r>
+          </w:p>
+        </w:tc>
+        <w:tc>
+          <w:tcPr>
+            <w:tcW w:type="dxa" w:w="7709"/>
           </w:tcPr>
           <w:p>
             <w:r>

</xml_diff>